<commit_message>
Paper: grounding, STER justification, tone corrections, contributions rebalanced
</commit_message>
<xml_diff>
--- a/paper/P2_IEEE_ESL_Draft_Pivot.docx
+++ b/paper/P2_IEEE_ESL_Draft_Pivot.docx
@@ -127,7 +127,7 @@
                 <w:sz w:val="18"/>
                 <w:szCs w:val="18"/>
               </w:rPr>
-              <w:t xml:space="preserve">Output correctness and timing reliability are independent safety properties of edge AI inference pipelines—yet FDA pre-market validation assesses neither under deployment conditions. This letter demonstrates this independence through a controlled experiment: the same MobileNetV2 model is evaluated under identical adversarial load on two execution paths of the same physical hardware—a dedicated GPU accelerator (TensorRT FP16) and a general-purpose CPU (ONNX Runtime FP32)—on the NVIDIA Jetson Orin Nano Super. Across five stressor classes and ∼158,000 inference activations, both paths maintain STER = 0.0000 (zero output exceedances above T* = 0.05), confirming output stability is not the failure mode. The paths diverge sharply on timing: the GPU path maintains latency &lt;15 ms under all conditions; the CPU path degrades 7.2× under combined load (14.5 ms to 104.0 ms mean, P99 = 165.1 ms), breaching the 10 Hz clinical cycle budget by 65%. Because same-hardware design eliminates platform confounds, this result causally attributes timing safety to the dedicated accelerator architecture. A device can be output-correct and still clinically unsafe: the Safety-Threshold Exceedance Rate (STER) verifies output bounds; latency verification is required for timing safety. Both are proposed as joint pre-market acceptance criteria under FDA Draft Guidance FDA-2024-D-4488 (January 2025).</w:t>
+              <w:t xml:space="preserve">Output correctness and timing reliability are independent safety properties of edge AI inference pipelines—yet FDA pre-market validation assesses neither under deployment conditions. This letter demonstrates this independence through a controlled experiment: the same MobileNetV2 model is evaluated under identical adversarial load on two execution paths of the same physical hardware—a dedicated GPU accelerator (TensorRT FP16) and a general-purpose CPU (ONNX Runtime FP32)—on the NVIDIA Jetson Orin Nano Super. Across five stressor classes and ∼158,000 inference activations, both paths maintain STER = 0.0000 (zero output exceedances above T* = 0.05), confirming output stability is not the failure mode. The paths diverge sharply on timing: the GPU path maintains latency &lt;15 ms under all conditions; the CPU path degrades 7.2× under combined load (14.5 ms to 104.0 ms mean, P99 = 165.1 ms), breaching the 10 Hz clinical cycle budget by 65%. Because same-hardware design eliminates platform confounds, this result is consistent with causal attribution of timing safety to the dedicated accelerator architecture. A device can be output-correct and still clinically unsafe: the Safety-Threshold Exceedance Rate (STER) verifies output bounds; latency verification is required for timing safety. Both are proposed as joint pre-market acceptance criteria under FDA Draft Guidance FDA-2024-D-4488 (January 2025).</w:t>
             </w:r>
           </w:p>
         </w:tc>
@@ -215,7 +215,7 @@
           <w:sz w:val="20"/>
           <w:szCs w:val="20"/>
         </w:rPr>
-        <w:t xml:space="preserve">FDA pre-market validation of AI-enabled medical devices assesses model performance through accuracy-based metrics—sensitivity, specificity, AUC—measured on curated test datasets under controlled, zero-contention conditions [1]. This evaluation framework characterizes neither inference output stability nor timing reliability under the system-level resource contention typical of real-world clinical deployment: concurrent background processes, memory pressure from telemetry and logging, and co-resident workloads competing for CPU cycles and memory bandwidth.</w:t>
+        <w:t xml:space="preserve">FDA pre-market validation of AI-enabled medical devices assesses model performance through accuracy-based metrics—sensitivity, specificity, AUC—measured on curated test datasets under controlled, zero-contention conditions [1]. This evaluation framework does not explicitly characterize inference output stability or timing reliability under the system-level resource contention typical of real-world clinical deployment: concurrent background processes, memory pressure from telemetry and logging, and co-resident workloads competing for CPU cycles and memory bandwidth.</w:t>
       </w:r>
     </w:p>
     <w:p>
@@ -229,7 +229,7 @@
           <w:sz w:val="20"/>
           <w:szCs w:val="20"/>
         </w:rPr>
-        <w:t xml:space="preserve">The clinical stakes of this gap are documented in the peer-reviewed literature. A 2025 cross-sectional study of 950 FDA-cleared AI-enabled medical devices found that diagnostic or measurement errors were the leading cause of AI device recalls, and that 43% of all recalls occurred within the first year of clearance [15]. These findings are consistent with a pre-market testing framework that does not require manufacturers to verify that inference outputs remain within bounds—or that inference timing remains within clinical cycle budgets—under foreseeable deployment conditions. This letter addresses both gaps through a controlled experiment that isolates the architectural contribution of a dedicated inference accelerator to each property independently.</w:t>
+        <w:t xml:space="preserve">The clinical stakes of this gap are documented in the peer-reviewed literature. A 2025 cross-sectional study of 950 FDA-cleared AI-enabled medical devices found that diagnostic or measurement errors were the leading cause of AI device recalls, and that 43% of all recalls occurred within the first year of clearance [15]. These findings are consistent with a pre-market testing framework that evaluates model performance under controlled, zero-contention conditions but does not explicitly require verification of inference output stability or timing reliability under foreseeable deployment load. IEC 62304-classified devices are required to meet their timing specifications under all operating conditions [8], yet no standardized empirical method exists for characterizing whether inference timing is preserved when the deployment environment is under stress. This letter addresses both gaps through a controlled experiment that isolates the architectural contribution of a dedicated inference accelerator to each property independently.</w:t>
       </w:r>
     </w:p>
     <w:p>
@@ -243,7 +243,7 @@
           <w:sz w:val="20"/>
           <w:szCs w:val="20"/>
         </w:rPr>
-        <w:t xml:space="preserve">FDA's January 2025 Draft Guidance (Docket FDA-2024-D-4488) takes a first step toward closing this gap, requiring manufacturers to assess robustness to "reasonably foreseeable conditions of use" and to monitor performance for degradation after deployment [2]. The guidance does not specify empirical methods for characterizing inference output stability or timing reliability under resource contention, nor does it propose candidate metrics for pre-market testing of these properties. This letter provides controlled experimental evidence: by running identical models under identical stressors on both the GPU accelerator and the general-purpose CPU of the same hardware, we isolate the architectural contribution to each safety property and propose joint STER + latency verification as a concrete pre-market acceptance protocol.</w:t>
+        <w:t xml:space="preserve">FDA's January 2025 Draft Guidance (Docket FDA-2024-D-4488) takes a first step toward closing this gap, requiring manufacturers to assess robustness to "reasonably foreseeable conditions of use" and to monitor performance for degradation after deployment [2]. The guidance does not specify empirical methods for characterizing inference output stability or timing reliability under resource contention, nor does it propose candidate metrics for pre-market testing of these properties. IEC 62304 Clause 6.3.2 requires verification that software units meet their timing requirements under all foreseeable operating conditions [8]; however, no published method exists for empirically characterizing whether inference pipeline timing is preserved when the device operates under realistic deployment load. This letter provides controlled experimental evidence: by running identical models under identical stressors on both the GPU accelerator and the general-purpose CPU of the same hardware, we isolate the architectural contribution to each safety property and propose joint STER + latency verification as a concrete pre-market acceptance protocol.</w:t>
       </w:r>
     </w:p>
     <w:p>
@@ -292,7 +292,7 @@
           <w:sz w:val="20"/>
           <w:szCs w:val="20"/>
         </w:rPr>
-        <w:t xml:space="preserve">Controlled same-hardware isolation experiment: Identical model, identical stressors, two execution paths on the same physical chip. This design eliminates platform confounds and causally attributes timing safety to the dedicated GPU accelerator architecture—not to hardware differences or model configuration.</w:t>
+        <w:t xml:space="preserve">Output correctness and timing reliability are independent safety properties: on dedicated accelerator hardware, both are preserved under contention; on general-purpose CPU hardware, output correctness is preserved but timing reliability degrades 7.2×. Current FDA accuracy-based validation may not detect this distinction, as Δaccuracy &lt; 1.0% on both paths under all conditions.</w:t>
       </w:r>
     </w:p>
     <w:p>
@@ -310,7 +310,7 @@
           <w:sz w:val="20"/>
           <w:szCs w:val="20"/>
         </w:rPr>
-        <w:t xml:space="preserve">Output/timing independence demonstrated: Both execution paths maintain STER = 0.0000 under all stressors—output instability is not the failure mode. Timing diverges sharply: GPU path &lt;15 ms always; CPU path 7.2× degradation to 104 ms mean / 165 ms P99 under combined load, breaching the 10 Hz clinical cycle budget.</w:t>
+        <w:t xml:space="preserve">Controlled same-hardware evidence: Running the same model under identical stressors on both execution paths of the same Jetson Orin Nano Super eliminates platform confounds and supports attribution of timing behavior to the accelerator architecture. GPU path: STER = 0.0000 and latency &lt;15 ms under all conditions. CPU path: STER = 0.0000 but latency degrades to 104 ms mean / 165 ms P99 under combined load, breaching the 10 Hz clinical cycle budget by 65%.</w:t>
       </w:r>
     </w:p>
     <w:p>
@@ -328,7 +328,7 @@
           <w:sz w:val="20"/>
           <w:szCs w:val="20"/>
         </w:rPr>
-        <w:t xml:space="preserve">STER as output stability control: STER = 0.0000 across all conditions establishes that output distribution bounds are maintained—something accuracy-based testing cannot confirm. Accuracy is a function of argmax(σ(y)); STER is a function of the full distribution σ(y). These are structurally distinct properties.</w:t>
+        <w:t xml:space="preserve">Timing as the dominant failure mode: STER = 0.0000 on both paths establishes that output instability is not the failure mode under realistic contention, isolating timing degradation as the sole safety-relevant divergence. This result grounds the validation gap claim in experimental evidence rather than speculation.</w:t>
       </w:r>
     </w:p>
     <w:p>
@@ -346,7 +346,7 @@
           <w:sz w:val="20"/>
           <w:szCs w:val="20"/>
         </w:rPr>
-        <w:t xml:space="preserve">Pre-market protocol gap: Current FDA accuracy-based validation would pass both the GPU and CPU-only deployments without distinguishing their timing safety profiles. Joint STER + latency verification under foreseeable stressor conditions is proposed as a concrete, reproducible pre-market acceptance protocol.</w:t>
+        <w:t xml:space="preserve">Joint STER + latency pre-market protocol: A concrete acceptance protocol is proposed—STER ≤ STER_max AND latency_P99 ≤ T_n under foreseeable stressor conditions—operationalizing FDA Draft Guidance FDA-2024-D-4488’s robustness assessment requirement with reproducible, hardware-agnostic criteria consistent with IEC 62304 Clause 6.3.2. Current accuracy-based validation would pass both execution paths without distinguishing their timing safety profiles.</w:t>
       </w:r>
     </w:p>
     <w:p>
@@ -363,7 +363,7 @@
           <w:sz w:val="20"/>
           <w:szCs w:val="20"/>
         </w:rPr>
-        <w:t xml:space="preserve">CPU-only negative control: STER formally defined: ISO 14971-grounded candidate pre-market verification metric quantifying the proportion of inferences where the full output distribution exceeds a clinically-motivated tolerance band T* = 0.05—applicable to any edge AI platform with a deterministic or bounded-variance inference pipeline.</w:t>
+        <w:t xml:space="preserve">CPU-only negative control: Joint STER + latency pre-market protocol: A concrete acceptance protocol is proposed—STER ≤ STER_max AND latency_P99 ≤ T_n under foreseeable stressor conditions—operationalizing FDA Draft Guidance FDA-2024-D-4488’s robustness assessment requirement with reproducible, hardware-agnostic acceptance criteria consistent with IEC 62304 Clause 6.3.2.</w:t>
       </w:r>
     </w:p>
     <w:p>
@@ -640,7 +640,7 @@
           <w:sz w:val="20"/>
           <w:szCs w:val="20"/>
         </w:rPr>
-        <w:t xml:space="preserve">where 𝟙[·] is the indicator function. STER ∈ [0, 1]; STER = 0 under nominal conditions (E0 baseline target). STER is proposed as a candidate pre-market verification metric for characterizing inference output stability under reasonably foreseeable deployment conditions—not as an existing FDA-specified standard, but as a method for operationalizing the robustness assessment requirement in [2].</w:t>
+        <w:t xml:space="preserve">where 𝟙[·] is the indicator function. STER ∈ [0, 1]; STER = 0 under nominal conditions (E0 baseline target). STER ∈ [0, 1]; STER = 0 under nominal conditions (E0 baseline target). STER is proposed as a candidate pre-market verification metric for characterizing inference output stability under reasonably foreseeable deployment conditions—not as an existing FDA-specified standard, but as a method for operationalizing the robustness assessment requirement in [2]. Critically, STER provides a formal mechanism to verify output stability independently of timing behavior, enabling isolation of timing-related failures from functional correctness failures—the distinction that this letter demonstrates empirically in E1–E6.</w:t>
       </w:r>
     </w:p>
     <w:p>
@@ -10891,7 +10891,7 @@
           <w:sz w:val="20"/>
           <w:szCs w:val="20"/>
         </w:rPr>
-        <w:t xml:space="preserve">The controlled same-hardware experiment design is the methodological core of this letter. By running identical models under identical stressors on the GPU and CPU execution paths of the same Jetson Orin Nano Super, all between-platform confounds—thermal differences, memory topology differences, driver stack differences—are eliminated. The timing divergence observed (GPU: &lt;15 ms always; CPU: 7.2× degradation to 104 ms mean / 165 ms P99 under combined load) can therefore be causally attributed to the dedicated accelerator architecture rather than to incidental hardware differences. Standard accuracy-based FDA pre-market testing would pass both execution paths without distinguishing their timing safety profiles: Δaccuracy &lt; 1.0% under all conditions on both paths. A manufacturer using accuracy-only testing would clear both a GPU-accelerated and a CPU-only deployment as equivalent—but the CPU-only deployment breaches the 10 Hz clinical cycle budget by 65% under combined load. STER confirms output distribution bounds on both paths; latency measurement under contention is the additional verification required to distinguish them. This is the pre-market testing gap that joint STER + latency verification closes.</w:t>
+        <w:t xml:space="preserve">The controlled same-hardware experiment design is the methodological core of this letter. By running identical models under identical stressors on the GPU and CPU execution paths of the same Jetson Orin Nano Super, all between-platform confounds—thermal differences, memory topology differences, driver stack differences—are eliminated. The timing divergence observed (GPU: &lt;15 ms always; CPU: 7.2× degradation to 104 ms mean / 165 ms P99 under combined load) is consistent with causal attribution to the dedicated accelerator architecture, as same-hardware design controls for chip-to-chip and thermal variation. Standard accuracy-based FDA pre-market testing would pass both execution paths without distinguishing their timing safety profiles: Δaccuracy &lt; 1.0% under all conditions on both paths. A manufacturer using accuracy-only testing would clear both a GPU-accelerated and a CPU-only deployment as equivalent—but the CPU-only deployment breaches the 10 Hz clinical cycle budget by 65% under combined load. STER confirms output distribution bounds on both paths; latency measurement under contention is the additional verification required to distinguish them. This is the pre-market testing gap that joint STER + latency verification closes.</w:t>
       </w:r>
     </w:p>
     <w:p>
@@ -10966,7 +10966,7 @@
           <w:sz w:val="20"/>
           <w:szCs w:val="20"/>
         </w:rPr>
-        <w:t xml:space="preserve">E6 provides the causal evidence that distinguishes the GPU path’s safety properties from incidental hardware characteristics. Running MobileNetV2 FP32 via ONNX Runtime on the same Jetson Orin Nano Super—identical silicon, identical stressors, identical model, different execution path—produces STER = 0.0000 and δ = 0.0000 exactly across 50,000 inferences. ONNX Runtime’s CPUExecutionProvider uses deterministic ARM NEON SIMD operations; CPU scheduling pressure delays computation but does not perturb its arithmetic. This confirms that output numerical stability is a property of deterministic floating-point execution independent of the accelerator. The accelerator’s contribution is therefore exclusively timing isolation: the GPU path maintains latency &lt;15 ms under all conditions; the CPU path degrades to 104.0 ms mean and 165.1 ms P99 under combined load, breaching the 10 Hz cycle budget by 65%. For SaMD operating at a fixed activation rate, this timing failure is a deployment safety violation that is invisible to STER, invisible to accuracy, and invisible to any output-only evaluation method. E6 establishes that architectural choice—not model correctness, not software configuration—is the primary determinant of timing safety in edge AI SaMD deployment.</w:t>
+        <w:t xml:space="preserve">E6 provides the causal evidence that distinguishes the GPU path’s safety properties from incidental hardware characteristics. Running MobileNetV2 FP32 via ONNX Runtime on the same Jetson Orin Nano Super—identical silicon, identical stressors, identical model, different execution path—produces STER = 0.0000 and δ = 0.0000 exactly across 50,000 inferences. ONNX Runtime’s CPUExecutionProvider uses deterministic ARM NEON SIMD operations; CPU scheduling pressure delays computation but does not perturb its arithmetic. This confirms that output numerical stability is a property of deterministic floating-point execution independent of the accelerator. The accelerator’s contribution is therefore exclusively timing isolation: the GPU path maintains latency &lt;15 ms under all conditions; the CPU path degrades to 104.0 ms mean and 165.1 ms P99 under combined load, breaching the 10 Hz cycle budget by 65%. For SaMD operating at a fixed activation rate, this timing failure is a deployment safety violation that is invisible to STER, invisible to accuracy, and invisible to any output-only evaluation method. E6 provides evidence that architectural choice—not model correctness, not software configuration—is the dominant determinant of timing safety in the evaluated edge AI SaMD deployment configuration.</w:t>
       </w:r>
     </w:p>
     <w:p>
@@ -11060,7 +11060,7 @@
           <w:sz w:val="20"/>
           <w:szCs w:val="20"/>
         </w:rPr>
-        <w:t xml:space="preserve">This letter has demonstrated, through a controlled same-hardware experiment, that output correctness and timing reliability are independent safety properties of edge AI inference pipelines—and that dedicated inference accelerators provide timing isolation as a distinct architectural safety primitive. Running MobileNetV2 under identical adversarial stressors on the GPU and CPU execution paths of the same Jetson Orin Nano Super, both paths maintain STER = 0.0000 (zero output exceedances above T* = 0.05) across ∼158,000 inference activations. The paths diverge sharply on timing: the GPU path maintains latency &lt;15 ms under all conditions; the CPU path degrades 7.2× to 104.0 ms mean / 165.1 ms P99 under combined load, breaching the 10 Hz clinical cycle budget by 65%. Because the same-hardware design eliminates platform confounds, this timing divergence is causally attributable to the dedicated accelerator architecture. Standard accuracy-based FDA pre-market testing would pass both execution paths without distinguishing their timing safety profiles. STER verifies output distribution bounds—something accuracy structurally cannot—but cannot detect timing failure. Joint STER + latency verification under foreseeable stressor conditions is proposed as a concrete pre-market acceptance protocol for edge-deployed SaMD, operationalizing the robustness assessment requirement of FDA Draft Guidance FDA-2024-D-4488 and consistent with IEC 62304 and ISO 14971.</w:t>
+        <w:t xml:space="preserve">This letter has demonstrated, through a controlled same-hardware experiment, that output correctness and timing reliability are independent safety properties of edge AI inference pipelines—and that dedicated inference accelerators provide timing isolation as a distinct architectural safety primitive. Running MobileNetV2 under identical adversarial stressors on the GPU and CPU execution paths of the same Jetson Orin Nano Super, both paths maintain STER = 0.0000 (zero output exceedances above T* = 0.05) across ∼158,000 inference activations. The paths diverge sharply on timing: the GPU path maintains latency &lt;15 ms under all conditions; the CPU path degrades 7.2× to 104.0 ms mean / 165.1 ms P99 under combined load, breaching the 10 Hz clinical cycle budget by 65%. Because the same-hardware design eliminates platform confounds, this timing divergence is consistent with causal attribution to the dedicated accelerator architecture. Standard accuracy-based FDA pre-market testing would pass both execution paths without distinguishing their timing safety profiles. STER verifies output distribution bounds—something accuracy structurally cannot—but cannot detect timing failure. Joint STER + latency verification under foreseeable stressor conditions is proposed as a concrete pre-market acceptance protocol for edge-deployed SaMD, operationalizing the robustness assessment requirement of FDA Draft Guidance FDA-2024-D-4488 and consistent with IEC 62304 and ISO 14971. These results indicate that ensuring output correctness alone may be insufficient for reliable clinical deployment; temporal behavior under realistic system contention must be explicitly validated.</w:t>
       </w:r>
     </w:p>
     <w:p>

</xml_diff>